<commit_message>
Test Cases: TC-HS-03 describes the tier filter that exists (Codex review)
Co-Authored-By: Claude Opus 5.5 <noreply@anthropic.com>
Claude-Session: https://claude.ai/code/session_01AFyT24RkX37m2MoRPATyVx
</commit_message>
<xml_diff>
--- a/Documents/Test_Cases_ChurnSight_v2_0.docx
+++ b/Documents/Test_Cases_ChurnSight_v2_0.docx
@@ -3437,7 +3437,7 @@
                 <w:sz w:val="18"/>
                 <w:szCs w:val="18"/>
               </w:rPr>
-              <w:t xml:space="preserve">Click "Critical" KPI tile</w:t>
+              <w:t xml:space="preserve">Click the "High" tier filter button</w:t>
             </w:r>
           </w:p>
         </w:tc>
@@ -3459,7 +3459,7 @@
                 <w:sz w:val="18"/>
                 <w:szCs w:val="18"/>
               </w:rPr>
-              <w:t xml:space="preserve">Only Critical-tier cards displayed</w:t>
+              <w:t xml:space="preserve">Only High-risk cards displayed</w:t>
             </w:r>
           </w:p>
         </w:tc>
@@ -3481,7 +3481,7 @@
                 <w:sz w:val="18"/>
                 <w:szCs w:val="18"/>
               </w:rPr>
-              <w:t xml:space="preserve">Pass</w:t>
+              <w:t xml:space="preserve">Not run (tier buttons All/High/Medium/Low exist; KPI-tile filter is not built — Sprint 2)</w:t>
             </w:r>
           </w:p>
         </w:tc>

</xml_diff>

<commit_message>
Test Cases: TC-HS-06/07 cover DEC-03 (re-normalised score, coverage, Limited data) — Codex review
Co-Authored-By: Claude Opus 5.5 <noreply@anthropic.com>
Claude-Session: https://claude.ai/code/session_01AFyT24RkX37m2MoRPATyVx
</commit_message>
<xml_diff>
--- a/Documents/Test_Cases_ChurnSight_v2_0.docx
+++ b/Documents/Test_Cases_ChurnSight_v2_0.docx
@@ -3754,6 +3754,274 @@
           </w:p>
         </w:tc>
       </w:tr>
+      <w:tr>
+        <w:tc>
+          <w:tcPr>
+            <w:tcW w:type="dxa" w:w="1080"/>
+            <w:shd w:fill="F2F4F7" w:color="auto" w:val="clear"/>
+            <w:tcMar>
+              <w:top w:type="dxa" w:w="80"/>
+              <w:left w:type="dxa" w:w="120"/>
+              <w:bottom w:type="dxa" w:w="80"/>
+              <w:right w:type="dxa" w:w="120"/>
+            </w:tcMar>
+          </w:tcPr>
+          <w:p>
+            <w:r>
+              <w:rPr>
+                <w:color w:val="1E293B"/>
+                <w:sz w:val="18"/>
+                <w:szCs w:val="18"/>
+              </w:rPr>
+              <w:t xml:space="preserve">TC-HS-06</w:t>
+            </w:r>
+          </w:p>
+        </w:tc>
+        <w:tc>
+          <w:tcPr>
+            <w:tcW w:type="dxa" w:w="1697"/>
+            <w:shd w:fill="F2F4F7" w:color="auto" w:val="clear"/>
+            <w:tcMar>
+              <w:top w:type="dxa" w:w="80"/>
+              <w:left w:type="dxa" w:w="120"/>
+              <w:bottom w:type="dxa" w:w="80"/>
+              <w:right w:type="dxa" w:w="120"/>
+            </w:tcMar>
+          </w:tcPr>
+          <w:p>
+            <w:r>
+              <w:rPr>
+                <w:color w:val="1E293B"/>
+                <w:sz w:val="18"/>
+                <w:szCs w:val="18"/>
+              </w:rPr>
+              <w:t xml:space="preserve">Partial data — re-normalised score</w:t>
+            </w:r>
+          </w:p>
+        </w:tc>
+        <w:tc>
+          <w:tcPr>
+            <w:tcW w:type="dxa" w:w="1697"/>
+            <w:shd w:fill="F2F4F7" w:color="auto" w:val="clear"/>
+            <w:tcMar>
+              <w:top w:type="dxa" w:w="80"/>
+              <w:left w:type="dxa" w:w="120"/>
+              <w:bottom w:type="dxa" w:w="80"/>
+              <w:right w:type="dxa" w:w="120"/>
+            </w:tcMar>
+          </w:tcPr>
+          <w:p>
+            <w:r>
+              <w:rPr>
+                <w:color w:val="1E293B"/>
+                <w:sz w:val="18"/>
+                <w:szCs w:val="18"/>
+              </w:rPr>
+              <w:t xml:space="preserve">Dataset has churn model + support + payment columns, no adoption / engagement / contract data</w:t>
+            </w:r>
+          </w:p>
+        </w:tc>
+        <w:tc>
+          <w:tcPr>
+            <w:tcW w:type="dxa" w:w="2006"/>
+            <w:shd w:fill="F2F4F7" w:color="auto" w:val="clear"/>
+            <w:tcMar>
+              <w:top w:type="dxa" w:w="80"/>
+              <w:left w:type="dxa" w:w="120"/>
+              <w:bottom w:type="dxa" w:w="80"/>
+              <w:right w:type="dxa" w:w="120"/>
+            </w:tcMar>
+          </w:tcPr>
+          <w:p>
+            <w:r>
+              <w:rPr>
+                <w:color w:val="1E293B"/>
+                <w:sz w:val="18"/>
+                <w:szCs w:val="18"/>
+              </w:rPr>
+              <w:t xml:space="preserve">Upload; open Health Scores</w:t>
+            </w:r>
+          </w:p>
+        </w:tc>
+        <w:tc>
+          <w:tcPr>
+            <w:tcW w:type="dxa" w:w="2314"/>
+            <w:shd w:fill="F2F4F7" w:color="auto" w:val="clear"/>
+            <w:tcMar>
+              <w:top w:type="dxa" w:w="80"/>
+              <w:left w:type="dxa" w:w="120"/>
+              <w:bottom w:type="dxa" w:w="80"/>
+              <w:right w:type="dxa" w:w="120"/>
+            </w:tcMar>
+          </w:tcPr>
+          <w:p>
+            <w:r>
+              <w:rPr>
+                <w:color w:val="1E293B"/>
+                <w:sz w:val="18"/>
+                <w:szCs w:val="18"/>
+              </w:rPr>
+              <w:t xml:space="preserve">Each card shows a 0–100 score from the 3 available components with weights re-normalised (25+20+15 → 100%); coverage shown as 60%; no "Limited data" label; upload accepted</w:t>
+            </w:r>
+          </w:p>
+        </w:tc>
+        <w:tc>
+          <w:tcPr>
+            <w:tcW w:type="dxa" w:w="926"/>
+            <w:shd w:fill="F2F4F7" w:color="auto" w:val="clear"/>
+            <w:tcMar>
+              <w:top w:type="dxa" w:w="80"/>
+              <w:left w:type="dxa" w:w="120"/>
+              <w:bottom w:type="dxa" w:w="80"/>
+              <w:right w:type="dxa" w:w="120"/>
+            </w:tcMar>
+          </w:tcPr>
+          <w:p>
+            <w:r>
+              <w:rPr>
+                <w:color w:val="1E293B"/>
+                <w:sz w:val="18"/>
+                <w:szCs w:val="18"/>
+              </w:rPr>
+              <w:t xml:space="preserve">Not built (Sprint 1, CS2-03)</w:t>
+            </w:r>
+          </w:p>
+        </w:tc>
+      </w:tr>
+      <w:tr>
+        <w:tc>
+          <w:tcPr>
+            <w:tcW w:type="dxa" w:w="1080"/>
+            <w:shd w:fill="FFFFFF" w:color="auto" w:val="clear"/>
+            <w:tcMar>
+              <w:top w:type="dxa" w:w="80"/>
+              <w:left w:type="dxa" w:w="120"/>
+              <w:bottom w:type="dxa" w:w="80"/>
+              <w:right w:type="dxa" w:w="120"/>
+            </w:tcMar>
+          </w:tcPr>
+          <w:p>
+            <w:r>
+              <w:rPr>
+                <w:color w:val="1E293B"/>
+                <w:sz w:val="18"/>
+                <w:szCs w:val="18"/>
+              </w:rPr>
+              <w:t xml:space="preserve">TC-HS-07</w:t>
+            </w:r>
+          </w:p>
+        </w:tc>
+        <w:tc>
+          <w:tcPr>
+            <w:tcW w:type="dxa" w:w="1697"/>
+            <w:shd w:fill="FFFFFF" w:color="auto" w:val="clear"/>
+            <w:tcMar>
+              <w:top w:type="dxa" w:w="80"/>
+              <w:left w:type="dxa" w:w="120"/>
+              <w:bottom w:type="dxa" w:w="80"/>
+              <w:right w:type="dxa" w:w="120"/>
+            </w:tcMar>
+          </w:tcPr>
+          <w:p>
+            <w:r>
+              <w:rPr>
+                <w:color w:val="1E293B"/>
+                <w:sz w:val="18"/>
+                <w:szCs w:val="18"/>
+              </w:rPr>
+              <w:t xml:space="preserve">Low coverage — Limited data</w:t>
+            </w:r>
+          </w:p>
+        </w:tc>
+        <w:tc>
+          <w:tcPr>
+            <w:tcW w:type="dxa" w:w="1697"/>
+            <w:shd w:fill="FFFFFF" w:color="auto" w:val="clear"/>
+            <w:tcMar>
+              <w:top w:type="dxa" w:w="80"/>
+              <w:left w:type="dxa" w:w="120"/>
+              <w:bottom w:type="dxa" w:w="80"/>
+              <w:right w:type="dxa" w:w="120"/>
+            </w:tcMar>
+          </w:tcPr>
+          <w:p>
+            <w:r>
+              <w:rPr>
+                <w:color w:val="1E293B"/>
+                <w:sz w:val="18"/>
+                <w:szCs w:val="18"/>
+              </w:rPr>
+              <w:t xml:space="preserve">Dataset has only the columns the churn model needs</w:t>
+            </w:r>
+          </w:p>
+        </w:tc>
+        <w:tc>
+          <w:tcPr>
+            <w:tcW w:type="dxa" w:w="2006"/>
+            <w:shd w:fill="FFFFFF" w:color="auto" w:val="clear"/>
+            <w:tcMar>
+              <w:top w:type="dxa" w:w="80"/>
+              <w:left w:type="dxa" w:w="120"/>
+              <w:bottom w:type="dxa" w:w="80"/>
+              <w:right w:type="dxa" w:w="120"/>
+            </w:tcMar>
+          </w:tcPr>
+          <w:p>
+            <w:r>
+              <w:rPr>
+                <w:color w:val="1E293B"/>
+                <w:sz w:val="18"/>
+                <w:szCs w:val="18"/>
+              </w:rPr>
+              <w:t xml:space="preserve">Upload; open Health Scores</w:t>
+            </w:r>
+          </w:p>
+        </w:tc>
+        <w:tc>
+          <w:tcPr>
+            <w:tcW w:type="dxa" w:w="2314"/>
+            <w:shd w:fill="FFFFFF" w:color="auto" w:val="clear"/>
+            <w:tcMar>
+              <w:top w:type="dxa" w:w="80"/>
+              <w:left w:type="dxa" w:w="120"/>
+              <w:bottom w:type="dxa" w:w="80"/>
+              <w:right w:type="dxa" w:w="120"/>
+            </w:tcMar>
+          </w:tcPr>
+          <w:p>
+            <w:r>
+              <w:rPr>
+                <w:color w:val="1E293B"/>
+                <w:sz w:val="18"/>
+                <w:szCs w:val="18"/>
+              </w:rPr>
+              <w:t xml:space="preserve">Upload accepted; score equals the churn-model component; coverage shown as 25%; card marked "Limited data"</w:t>
+            </w:r>
+          </w:p>
+        </w:tc>
+        <w:tc>
+          <w:tcPr>
+            <w:tcW w:type="dxa" w:w="926"/>
+            <w:shd w:fill="FFFFFF" w:color="auto" w:val="clear"/>
+            <w:tcMar>
+              <w:top w:type="dxa" w:w="80"/>
+              <w:left w:type="dxa" w:w="120"/>
+              <w:bottom w:type="dxa" w:w="80"/>
+              <w:right w:type="dxa" w:w="120"/>
+            </w:tcMar>
+          </w:tcPr>
+          <w:p>
+            <w:r>
+              <w:rPr>
+                <w:color w:val="1E293B"/>
+                <w:sz w:val="18"/>
+                <w:szCs w:val="18"/>
+              </w:rPr>
+              <w:t xml:space="preserve">Not built (Sprint 1, CS2-03)</w:t>
+            </w:r>
+          </w:p>
+        </w:tc>
+      </w:tr>
     </w:tbl>
     <w:p>
       <w:pPr>
@@ -10492,6 +10760,24 @@
           <w:szCs w:val="20"/>
         </w:rPr>
         <w:t xml:space="preserve">15 Oct 2026 — TC-HS-02 status points to CS2-04b (decision DEC-01).</w:t>
+      </w:r>
+    </w:p>
+    <w:p>
+      <w:pPr>
+        <w:spacing w:after="80" w:before="60"/>
+        <w:jc w:val="left"/>
+      </w:pPr>
+      <w:r>
+        <w:rPr>
+          <w:b w:val="false"/>
+          <w:bCs w:val="false"/>
+          <w:i w:val="false"/>
+          <w:iCs w:val="false"/>
+          <w:color w:val="1E293B"/>
+          <w:sz w:val="20"/>
+          <w:szCs w:val="20"/>
+        </w:rPr>
+        <w:t xml:space="preserve">15 Oct 2026 — Added TC-HS-06 and TC-HS-07 for decision DEC-03 (re-normalised score, coverage, "Limited data").</w:t>
       </w:r>
     </w:p>
     <w:sectPr>

</xml_diff>